<commit_message>
Added Architekturübersicht V1.0 Lastenheft V6.6 DB-Schema V1.2
</commit_message>
<xml_diff>
--- a/docs/Lastenheft_Kirchenplanung.docx
+++ b/docs/Lastenheft_Kirchenplanung.docx
@@ -45,7 +45,7 @@
           <w:sz w:val="22"/>
           <w:szCs w:val="22"/>
         </w:rPr>
-        <w:t xml:space="preserve">Version 6.5 – konsolidiert</w:t>
+        <w:t xml:space="preserve">Version 6.6 – konsolidiert</w:t>
       </w:r>
     </w:p>
     <w:p>
@@ -3744,6 +3744,38 @@
     </w:p>
     <w:p>
       <w:pPr>
+        <w:pStyle w:val="ListParagraph"/>
+        <w:numPr>
+          <w:ilvl w:val="0"/>
+          <w:numId w:val="2"/>
+        </w:numPr>
+      </w:pPr>
+      <w:r>
+        <w:rPr>
+          <w:sz w:val="22"/>
+          <w:szCs w:val="22"/>
+        </w:rPr>
+        <w:t xml:space="preserve">Automatische Dienstplan-Generierung oder Rotationslogik</w:t>
+      </w:r>
+    </w:p>
+    <w:p>
+      <w:pPr>
+        <w:pStyle w:val="ListParagraph"/>
+        <w:numPr>
+          <w:ilvl w:val="0"/>
+          <w:numId w:val="2"/>
+        </w:numPr>
+      </w:pPr>
+      <w:r>
+        <w:rPr>
+          <w:sz w:val="22"/>
+          <w:szCs w:val="22"/>
+        </w:rPr>
+        <w:t xml:space="preserve">Aktive Verknüpfung Dienstplan ↔ Anlass</w:t>
+      </w:r>
+    </w:p>
+    <w:p>
+      <w:pPr>
         <w:spacing w:after="80"/>
       </w:pPr>
       <w:r>
@@ -3766,7 +3798,322 @@
           <w:sz w:val="28"/>
           <w:szCs w:val="28"/>
         </w:rPr>
-        <w:t xml:space="preserve">13. Erweiterbarkeit (Future Scope)</w:t>
+        <w:t xml:space="preserve">13. Dienstplan</w:t>
+      </w:r>
+    </w:p>
+    <w:p>
+      <w:pPr>
+        <w:pStyle w:val="Heading2"/>
+        <w:spacing w:after="80" w:before="200"/>
+      </w:pPr>
+      <w:r>
+        <w:rPr>
+          <w:b/>
+          <w:bCs/>
+          <w:color w:val="3A6B8A"/>
+          <w:sz w:val="24"/>
+          <w:szCs w:val="24"/>
+        </w:rPr>
+        <w:t xml:space="preserve">13.1 Konzept</w:t>
+      </w:r>
+    </w:p>
+    <w:p>
+      <w:pPr>
+        <w:spacing w:after="120"/>
+      </w:pPr>
+      <w:r>
+        <w:rPr>
+          <w:sz w:val="22"/>
+          <w:szCs w:val="22"/>
+        </w:rPr>
+        <w:t xml:space="preserve">Der Dienstplan ist ein informatives Journal: er zeigt, wer an welchem Tag anwesend und erreichbar ist. Er ist bewusst von der Anlass-Verwaltung getrennt — die Verbindung zwischen Dienstplan und konkretem Anlass bleibt Menschensache und wird nicht automatisiert.</w:t>
+      </w:r>
+    </w:p>
+    <w:p>
+      <w:pPr>
+        <w:spacing w:after="120"/>
+      </w:pPr>
+      <w:r>
+        <w:rPr>
+          <w:sz w:val="22"/>
+          <w:szCs w:val="22"/>
+        </w:rPr>
+        <w:t xml:space="preserve">Hintergrund: Seelsorger sehen im Kalender wer Dienst hat und wissen damit, an wen sie Gottesdienst-Informationen schicken müssen. Gleichzeitig können Spezialfälle abgebildet werden (z.B. Mesmer an seinem freien Tag nur für eine Probe anwesend, aber nicht für den vollen Dienst verfügbar).</w:t>
+      </w:r>
+    </w:p>
+    <w:p>
+      <w:pPr>
+        <w:spacing w:after="80"/>
+      </w:pPr>
+      <w:r>
+        <w:t xml:space="preserve"/>
+      </w:r>
+    </w:p>
+    <w:p>
+      <w:pPr>
+        <w:pStyle w:val="Heading2"/>
+        <w:spacing w:after="80" w:before="200"/>
+      </w:pPr>
+      <w:r>
+        <w:rPr>
+          <w:b/>
+          <w:bCs/>
+          <w:color w:val="3A6B8A"/>
+          <w:sz w:val="24"/>
+          <w:szCs w:val="24"/>
+        </w:rPr>
+        <w:t xml:space="preserve">13.2 Abgrenzung</w:t>
+      </w:r>
+    </w:p>
+    <w:p>
+      <w:pPr>
+        <w:pStyle w:val="ListParagraph"/>
+        <w:numPr>
+          <w:ilvl w:val="0"/>
+          <w:numId w:val="2"/>
+        </w:numPr>
+      </w:pPr>
+      <w:r>
+        <w:rPr>
+          <w:sz w:val="22"/>
+          <w:szCs w:val="22"/>
+        </w:rPr>
+        <w:t xml:space="preserve">Dienstplan ≠ Anlass-Zuteilung: 'Wer hat heute Dienst' ist eine andere Frage als 'Wer ist Liturge/Organist bei diesem GD'</w:t>
+      </w:r>
+    </w:p>
+    <w:p>
+      <w:pPr>
+        <w:pStyle w:val="ListParagraph"/>
+        <w:numPr>
+          <w:ilvl w:val="0"/>
+          <w:numId w:val="2"/>
+        </w:numPr>
+      </w:pPr>
+      <w:r>
+        <w:rPr>
+          <w:sz w:val="22"/>
+          <w:szCs w:val="22"/>
+        </w:rPr>
+        <w:t xml:space="preserve">Keine automatische Verknüpfung mit Anlässen — Kalender zeigt beides nebeneinander, Interpretation erfolgt durch die Person</w:t>
+      </w:r>
+    </w:p>
+    <w:p>
+      <w:pPr>
+        <w:pStyle w:val="ListParagraph"/>
+        <w:numPr>
+          <w:ilvl w:val="0"/>
+          <w:numId w:val="2"/>
+        </w:numPr>
+      </w:pPr>
+      <w:r>
+        <w:rPr>
+          <w:sz w:val="22"/>
+          <w:szCs w:val="22"/>
+        </w:rPr>
+        <w:t xml:space="preserve">Keine Rotationslogik, keine Fairness-Algorithmen, kein Schichtplan-Generator — diese Absprachen erfolgen weiterhin im Team</w:t>
+      </w:r>
+    </w:p>
+    <w:p>
+      <w:pPr>
+        <w:pStyle w:val="ListParagraph"/>
+        <w:numPr>
+          <w:ilvl w:val="0"/>
+          <w:numId w:val="2"/>
+        </w:numPr>
+      </w:pPr>
+      <w:r>
+        <w:rPr>
+          <w:sz w:val="22"/>
+          <w:szCs w:val="22"/>
+        </w:rPr>
+        <w:t xml:space="preserve">Kein Override-Workflow: Einträge können von berechtigten Personen direkt erstellt und geändert werden</w:t>
+      </w:r>
+    </w:p>
+    <w:p>
+      <w:pPr>
+        <w:spacing w:after="80"/>
+      </w:pPr>
+      <w:r>
+        <w:t xml:space="preserve"/>
+      </w:r>
+    </w:p>
+    <w:p>
+      <w:pPr>
+        <w:pStyle w:val="Heading2"/>
+        <w:spacing w:after="80" w:before="200"/>
+      </w:pPr>
+      <w:r>
+        <w:rPr>
+          <w:b/>
+          <w:bCs/>
+          <w:color w:val="3A6B8A"/>
+          <w:sz w:val="24"/>
+          <w:szCs w:val="24"/>
+        </w:rPr>
+        <w:t xml:space="preserve">13.3 Datenmodell</w:t>
+      </w:r>
+    </w:p>
+    <w:p>
+      <w:pPr>
+        <w:pStyle w:val="ListParagraph"/>
+        <w:numPr>
+          <w:ilvl w:val="0"/>
+          <w:numId w:val="2"/>
+        </w:numPr>
+      </w:pPr>
+      <w:r>
+        <w:rPr>
+          <w:sz w:val="22"/>
+          <w:szCs w:val="22"/>
+        </w:rPr>
+        <w:t xml:space="preserve">Pro Eintrag: Datum, Person, Ganztags-Flag, optionale Start-/Endzeit, Freitext-Notiz</w:t>
+      </w:r>
+    </w:p>
+    <w:p>
+      <w:pPr>
+        <w:pStyle w:val="ListParagraph"/>
+        <w:numPr>
+          <w:ilvl w:val="0"/>
+          <w:numId w:val="2"/>
+        </w:numPr>
+      </w:pPr>
+      <w:r>
+        <w:rPr>
+          <w:sz w:val="22"/>
+          <w:szCs w:val="22"/>
+        </w:rPr>
+        <w:t xml:space="preserve">Teilpräsenz (is_full_day = false): Pflichtfelder Start- und Endzeit; Notizfeld für Kontext</w:t>
+      </w:r>
+    </w:p>
+    <w:p>
+      <w:pPr>
+        <w:pStyle w:val="ListParagraph"/>
+        <w:numPr>
+          <w:ilvl w:val="0"/>
+          <w:numId w:val="2"/>
+        </w:numPr>
+      </w:pPr>
+      <w:r>
+        <w:rPr>
+          <w:sz w:val="22"/>
+          <w:szCs w:val="22"/>
+        </w:rPr>
+        <w:t xml:space="preserve">Mehrere Einträge pro Tag möglich (z.B. Hauptmesmer + Stellvertretung gleichzeitig sichtbar)</w:t>
+      </w:r>
+    </w:p>
+    <w:p>
+      <w:pPr>
+        <w:pStyle w:val="ListParagraph"/>
+        <w:numPr>
+          <w:ilvl w:val="0"/>
+          <w:numId w:val="2"/>
+        </w:numPr>
+      </w:pPr>
+      <w:r>
+        <w:rPr>
+          <w:sz w:val="22"/>
+          <w:szCs w:val="22"/>
+        </w:rPr>
+        <w:t xml:space="preserve">Keine Konflikterkennung auf Dienstplan-Ebene</w:t>
+      </w:r>
+    </w:p>
+    <w:p>
+      <w:pPr>
+        <w:spacing w:after="80"/>
+      </w:pPr>
+      <w:r>
+        <w:t xml:space="preserve"/>
+      </w:r>
+    </w:p>
+    <w:p>
+      <w:pPr>
+        <w:pStyle w:val="Heading2"/>
+        <w:spacing w:after="80" w:before="200"/>
+      </w:pPr>
+      <w:r>
+        <w:rPr>
+          <w:b/>
+          <w:bCs/>
+          <w:color w:val="3A6B8A"/>
+          <w:sz w:val="24"/>
+          <w:szCs w:val="24"/>
+        </w:rPr>
+        <w:t xml:space="preserve">13.4 Sichtbarkeit</w:t>
+      </w:r>
+    </w:p>
+    <w:p>
+      <w:pPr>
+        <w:pStyle w:val="ListParagraph"/>
+        <w:numPr>
+          <w:ilvl w:val="0"/>
+          <w:numId w:val="2"/>
+        </w:numPr>
+      </w:pPr>
+      <w:r>
+        <w:rPr>
+          <w:sz w:val="22"/>
+          <w:szCs w:val="22"/>
+        </w:rPr>
+        <w:t xml:space="preserve">Dienstplan-Einträge sind im Kalender für alle eingeloggten User sichtbar</w:t>
+      </w:r>
+    </w:p>
+    <w:p>
+      <w:pPr>
+        <w:pStyle w:val="ListParagraph"/>
+        <w:numPr>
+          <w:ilvl w:val="0"/>
+          <w:numId w:val="2"/>
+        </w:numPr>
+      </w:pPr>
+      <w:r>
+        <w:rPr>
+          <w:sz w:val="22"/>
+          <w:szCs w:val="22"/>
+        </w:rPr>
+        <w:t xml:space="preserve">Nicht eingeloggte Benutzer sehen keine Dienstplan-Informationen (Personendaten)</w:t>
+      </w:r>
+    </w:p>
+    <w:p>
+      <w:pPr>
+        <w:pStyle w:val="ListParagraph"/>
+        <w:numPr>
+          <w:ilvl w:val="0"/>
+          <w:numId w:val="2"/>
+        </w:numPr>
+      </w:pPr>
+      <w:r>
+        <w:rPr>
+          <w:sz w:val="22"/>
+          <w:szCs w:val="22"/>
+        </w:rPr>
+        <w:t xml:space="preserve">Erfassung und Bearbeitung: Requester und höher</w:t>
+      </w:r>
+    </w:p>
+    <w:p>
+      <w:pPr>
+        <w:spacing w:after="80"/>
+      </w:pPr>
+      <w:r>
+        <w:t xml:space="preserve"/>
+      </w:r>
+    </w:p>
+    <w:p>
+      <w:pPr>
+        <w:pStyle w:val="Heading1"/>
+        <w:pBdr>
+          <w:bottom w:val="single" w:color="AABBD0" w:sz="4" w:space="1"/>
+        </w:pBdr>
+        <w:spacing w:after="120" w:before="320"/>
+      </w:pPr>
+      <w:r>
+        <w:rPr>
+          <w:b/>
+          <w:bCs/>
+          <w:color w:val="2E4057"/>
+          <w:sz w:val="28"/>
+          <w:szCs w:val="28"/>
+        </w:rPr>
+        <w:t xml:space="preserve">14. Erweiterbarkeit (Future Scope)</w:t>
       </w:r>
     </w:p>
     <w:p>
@@ -3863,6 +4210,38 @@
           <w:szCs w:val="22"/>
         </w:rPr>
         <w:t xml:space="preserve">Automatische Eskalation bei überschrittener Freigabe-Deadline</w:t>
+      </w:r>
+    </w:p>
+    <w:p>
+      <w:pPr>
+        <w:pStyle w:val="ListParagraph"/>
+        <w:numPr>
+          <w:ilvl w:val="0"/>
+          <w:numId w:val="2"/>
+        </w:numPr>
+      </w:pPr>
+      <w:r>
+        <w:rPr>
+          <w:sz w:val="22"/>
+          <w:szCs w:val="22"/>
+        </w:rPr>
+        <w:t xml:space="preserve">Aktive Verknüpfung Dienstplan ↔ Anlass (automatische Zuteilung des Diensthabenden)</w:t>
+      </w:r>
+    </w:p>
+    <w:p>
+      <w:pPr>
+        <w:pStyle w:val="ListParagraph"/>
+        <w:numPr>
+          <w:ilvl w:val="0"/>
+          <w:numId w:val="2"/>
+        </w:numPr>
+      </w:pPr>
+      <w:r>
+        <w:rPr>
+          <w:sz w:val="22"/>
+          <w:szCs w:val="22"/>
+        </w:rPr>
+        <w:t xml:space="preserve">Dienstplan-Rotationslogik / Fairness-Auswertung</w:t>
       </w:r>
     </w:p>
     <w:p>
@@ -3889,7 +4268,7 @@
           <w:sz w:val="18"/>
           <w:szCs w:val="18"/>
         </w:rPr>
-        <w:t xml:space="preserve">Version 6.5 – konsolidiert  |  Erstellt mit KI-Unterstützung (Claude, Anthropic)</w:t>
+        <w:t xml:space="preserve">Version 6.6 – konsolidiert  |  Erstellt mit KI-Unterstützung (Claude, Anthropic)</w:t>
       </w:r>
     </w:p>
     <w:sectPr>

</xml_diff>